<commit_message>
Soften the Economics currency claim to what the boards actually publish
The pack said AQA 7136 and Edexcel 9EC0 are "both unchanged" for a course
starting in September 2026. Only half of that is sourced. AQA's 7136 page
and Pearson's Economics A 2015 page carry no withdrawal or replacement
notice, which is an absence of news. Pearson's actual September 2026
continuation statement is for GCE Business; the Economics equivalent URL
404s. That is the same trap the GCSE finding recorded earlier: a Pearson
statement for one subject does not cover another.

Page 1 now says no replacement is announced and names the date the pages
were opened. Page 8 says what that does and does not prove.

Co-Authored-By: Claude Opus 5 <noreply@anthropic.com>
</commit_message>
<xml_diff>
--- a/resources/a-level-economics-first-term-survival-pack/A-Level-Economics-The-First-Term-Survival-Pack-EDITABLE.docx
+++ b/resources/a-level-economics-first-term-survival-pack/A-Level-Economics-The-First-Term-Survival-Pack-EDITABLE.docx
@@ -437,7 +437,7 @@
           <w:i w:val="0"/>
           <w:sz w:val="21"/>
         </w:rPr>
-        <w:t xml:space="preserve"> AQA 7136 and Edexcel 9EC0 are both unchanged for a course starting in September 2026. Nothing in this pack is written to a specification that is being withdrawn.</w:t>
+        <w:t xml:space="preserve"> Neither AQA 7136 nor Edexcel 9EC0 has a replacement announced, so nothing here is written to a specification that is being withdrawn. Both boards' own qualification pages were opened on 17 August 2026. Page 8 says what that does and does not prove.</w:t>
       </w:r>
     </w:p>
     <w:p>
@@ -4565,17 +4565,43 @@
           <w:i w:val="0"/>
           <w:sz w:val="23"/>
         </w:rPr>
-        <w:t>One thing this pack does not claim</w:t>
+        <w:t>Two things this pack does not claim</w:t>
       </w:r>
     </w:p>
     <w:p>
+      <w:r>
+        <w:rPr>
+          <w:b/>
+          <w:i w:val="0"/>
+          <w:sz w:val="21"/>
+        </w:rPr>
+        <w:t>A list of AQA Economics command words.</w:t>
+      </w:r>
       <w:r>
         <w:rPr>
           <w:b w:val="0"/>
           <w:i w:val="0"/>
           <w:sz w:val="21"/>
         </w:rPr>
-        <w:t>You may have seen a list of ten AQA Economics command words. AQA's own page for that list returns an error, and no AQA PDF we opened carries one. So this pack quotes the commands that appear on a real paper and in the published grids, and does not print a list. If AQA publishes one, we will add it and say where it came from.</w:t>
+        <w:t xml:space="preserve"> You may have seen one with ten entries. AQA's own page for it returns an error, and no AQA PDF we opened carries a list. So this pack quotes the commands that appear on a real paper and in the published grids, and prints no list.</w:t>
+      </w:r>
+    </w:p>
+    <w:p>
+      <w:r>
+        <w:rPr>
+          <w:b/>
+          <w:i w:val="0"/>
+          <w:sz w:val="21"/>
+        </w:rPr>
+        <w:t>That either board has promised nothing will change.</w:t>
+      </w:r>
+      <w:r>
+        <w:rPr>
+          <w:b w:val="0"/>
+          <w:i w:val="0"/>
+          <w:sz w:val="21"/>
+        </w:rPr>
+        <w:t xml:space="preserve"> Neither has announced a replacement, which is what we checked and all we can show. Note that Pearson's published September 2026 continuation statement covers GCE Business, not Economics, so for Edexcel this is an absence of news rather than a commitment from the board.</w:t>
       </w:r>
     </w:p>
     <w:p>

</xml_diff>